<commit_message>
docs(cv): describe the portfolio as text for ATS (2026 best practice)
An ATS can't see the visual portfolio site, so the portfolio work must be
represented as text in the resume. Add an 'Interactive 3D portfolio' entry to
Selected Projects with the plain-text URL (edgarhovsepyan.github.io) and the
tech keywords (Three.js, WebGL, GLSL raymarching, PixiJS) so parsers map it to
the JD. Applied to CV-2026.md + the ATS and Branded generators; regenerated the
ATS PDF/DOCX and Branded PDF (still 2 pages). Verified via text extraction:
project, URL and keywords are all selectable/parseable.
</commit_message>
<xml_diff>
--- a/public/cv/Edgar_Hovsepyan_CV_ATS.docx
+++ b/public/cv/Edgar_Hovsepyan_CV_ATS.docx
@@ -636,6 +636,32 @@
           <w:spacing w:val="16"/>
         </w:rPr>
         <w:t xml:space="preserve">SELECTED PROJECTS</w:t>
+      </w:r>
+    </w:p>
+    <w:p>
+      <w:pPr>
+        <w:pStyle w:val="ListParagraph"/>
+        <w:numPr>
+          <w:ilvl w:val="0"/>
+          <w:numId w:val="1"/>
+        </w:numPr>
+        <w:spacing w:after="40"/>
+      </w:pPr>
+      <w:r>
+        <w:rPr>
+          <w:b/>
+          <w:bCs/>
+          <w:sz w:val="19"/>
+          <w:szCs w:val="19"/>
+        </w:rPr>
+        <w:t xml:space="preserve">Interactive 3D portfolio</w:t>
+      </w:r>
+      <w:r>
+        <w:rPr>
+          <w:sz w:val="19"/>
+          <w:szCs w:val="19"/>
+        </w:rPr>
+        <w:t xml:space="preserve"> — edgarhovsepyan.github.io — Three.js / WebGL site with a hand-written raymarched volumetric GLSL shader background, a scroll-driven 360° WebGL panorama and PixiJS game demos; device-tiered for smooth desktop and mobile, with structured-data SEO.</w:t>
       </w:r>
     </w:p>
     <w:p>

</xml_diff>

<commit_message>
docs(cv): describe the portfolio as text for ATS
An ATS can't see the visual portfolio site, so the portfolio work must be
represented as text in the resume. Add an 'Interactive 3D portfolio' entry to
Selected Projects with the plain-text URL (edgarhovsepyan.github.io) and the
tech keywords (Three.js, WebGL, GLSL raymarching, PixiJS) so parsers map it to
the JD. Applied to CV-2026.md + the ATS and Branded generators; regenerated the
ATS PDF/DOCX and Branded PDF (still 2 pages). Verified via text extraction:
project, URL and keywords are all selectable/parseable.
</commit_message>
<xml_diff>
--- a/public/cv/Edgar_Hovsepyan_CV_ATS.docx
+++ b/public/cv/Edgar_Hovsepyan_CV_ATS.docx
@@ -636,6 +636,32 @@
           <w:spacing w:val="16"/>
         </w:rPr>
         <w:t xml:space="preserve">SELECTED PROJECTS</w:t>
+      </w:r>
+    </w:p>
+    <w:p>
+      <w:pPr>
+        <w:pStyle w:val="ListParagraph"/>
+        <w:numPr>
+          <w:ilvl w:val="0"/>
+          <w:numId w:val="1"/>
+        </w:numPr>
+        <w:spacing w:after="40"/>
+      </w:pPr>
+      <w:r>
+        <w:rPr>
+          <w:b/>
+          <w:bCs/>
+          <w:sz w:val="19"/>
+          <w:szCs w:val="19"/>
+        </w:rPr>
+        <w:t xml:space="preserve">Interactive 3D portfolio</w:t>
+      </w:r>
+      <w:r>
+        <w:rPr>
+          <w:sz w:val="19"/>
+          <w:szCs w:val="19"/>
+        </w:rPr>
+        <w:t xml:space="preserve"> — edgarhovsepyan.github.io — Three.js / WebGL site with a hand-written raymarched volumetric GLSL shader background, a scroll-driven 360° WebGL panorama and PixiJS game demos; device-tiered for smooth desktop and mobile, with structured-data SEO.</w:t>
       </w:r>
     </w:p>
     <w:p>

</xml_diff>